<commit_message>
docs: Add GitHub repository link into PDF and Word report (Sections 1.3 and 6.2)
</commit_message>
<xml_diff>
--- a/Bao_Cao_Do_An_BigData_NYC_2025.docx
+++ b/Bao_Cao_Do_An_BigData_NYC_2025.docx
@@ -134,7 +134,7 @@
           <w:noProof/>
         </w:rPr>
         <w:drawing>
-          <wp:inline distT="0" distB="0" distL="0" distR="0" wp14:anchorId="56D202B4" wp14:editId="51BE9193">
+          <wp:inline distT="0" distB="0" distL="0" distR="0" wp14:anchorId="2E470DF1" wp14:editId="76EE9D0E">
             <wp:extent cx="1080000" cy="1080000"/>
             <wp:effectExtent l="0" t="0" r="0" b="0"/>
             <wp:docPr id="1" name="Picture 1"/>
@@ -8440,6 +8440,56 @@
       <w:pPr>
         <w:spacing w:before="60" w:after="60" w:line="288" w:lineRule="auto"/>
         <w:ind w:firstLine="567"/>
+      </w:pPr>
+      <w:r>
+        <w:rPr>
+          <w:b/>
+          <w:sz w:val="24"/>
+        </w:rPr>
+        <w:t>Kho mã ngu</w:t>
+      </w:r>
+      <w:r>
+        <w:rPr>
+          <w:b/>
+          <w:sz w:val="24"/>
+        </w:rPr>
+        <w:t>ồ</w:t>
+      </w:r>
+      <w:r>
+        <w:rPr>
+          <w:b/>
+          <w:sz w:val="24"/>
+        </w:rPr>
+        <w:t>n chính th</w:t>
+      </w:r>
+      <w:r>
+        <w:rPr>
+          <w:b/>
+          <w:sz w:val="24"/>
+        </w:rPr>
+        <w:t>ứ</w:t>
+      </w:r>
+      <w:r>
+        <w:rPr>
+          <w:b/>
+          <w:sz w:val="24"/>
+        </w:rPr>
+        <w:t xml:space="preserve">c (GitHub Repository): </w:t>
+      </w:r>
+      <w:r>
+        <w:rPr>
+          <w:b/>
+          <w:color w:val="0066CC"/>
+          <w:sz w:val="24"/>
+          <w:u w:val="single"/>
+        </w:rPr>
+        <w:t>https://github.com/QuanPhan78/-n-big-data</w:t>
+      </w:r>
+    </w:p>
+    <w:p>
+      <w:pPr>
+        <w:spacing w:before="60" w:after="60" w:line="288" w:lineRule="auto"/>
+        <w:ind w:firstLine="567"/>
         <w:jc w:val="both"/>
       </w:pPr>
       <w:r>
@@ -10496,13 +10546,6 @@
                 <w:sz w:val="16"/>
               </w:rPr>
               <w:br/>
-            </w:r>
-            <w:r>
-              <w:rPr>
-                <w:rFonts w:ascii="Consolas" w:hAnsi="Consolas"/>
-                <w:color w:val="323232"/>
-                <w:sz w:val="16"/>
-              </w:rPr>
               <w:t>[SUCCESS] File successfully committed to HDFS cluster (Replication factor: 2).</w:t>
             </w:r>
           </w:p>
@@ -10808,13 +10851,6 @@
                 <w:sz w:val="16"/>
               </w:rPr>
               <w:br/>
-            </w:r>
-            <w:r>
-              <w:rPr>
-                <w:rFonts w:ascii="Consolas" w:hAnsi="Consolas"/>
-                <w:color w:val="323232"/>
-                <w:sz w:val="16"/>
-              </w:rPr>
               <w:t>Name: 172.20.0.3:9866 (datanode1) - State: In Service, DFS Used%: 0.12%</w:t>
             </w:r>
             <w:r>
@@ -12086,7 +12122,6 @@
                 <w:sz w:val="17"/>
               </w:rPr>
               <w:br/>
-              <w:t xml:space="preserve">    (col('trip_distance') &gt; 0) &amp; (col('trip_distance') &lt;= 100) &amp;</w:t>
             </w:r>
             <w:r>
               <w:rPr>
@@ -12094,8 +12129,7 @@
                 <w:color w:val="1E1E1E"/>
                 <w:sz w:val="17"/>
               </w:rPr>
-              <w:br/>
-              <w:t xml:space="preserve">    (col('duration_min') &gt; 0) &amp; (col('duration_min') &lt;= 360) &amp;</w:t>
+              <w:t xml:space="preserve">    (col('trip_distance') &gt; 0) &amp; (col('trip_distance') &lt;= 100) &amp;</w:t>
             </w:r>
             <w:r>
               <w:rPr>
@@ -12104,6 +12138,7 @@
                 <w:sz w:val="17"/>
               </w:rPr>
               <w:br/>
+              <w:t xml:space="preserve">    (col('duration_min') &gt; 0) &amp; (col('duration_min') &lt;= 360) &amp;</w:t>
             </w:r>
             <w:r>
               <w:rPr>
@@ -12111,6 +12146,7 @@
                 <w:color w:val="1E1E1E"/>
                 <w:sz w:val="17"/>
               </w:rPr>
+              <w:br/>
               <w:t xml:space="preserve">    (col('fare_amount') &gt;= 2.5) &amp; (col('fare_amount') &lt;= 500) &amp;</w:t>
             </w:r>
             <w:r>
@@ -25746,7 +25782,7 @@
         </w:rPr>
         <w:lastRenderedPageBreak/>
         <w:drawing>
-          <wp:inline distT="0" distB="0" distL="0" distR="0" wp14:anchorId="16E39A9B" wp14:editId="34AEFCDC">
+          <wp:inline distT="0" distB="0" distL="0" distR="0" wp14:anchorId="3B0C1F5E" wp14:editId="5B1C2799">
             <wp:extent cx="4937760" cy="1763486"/>
             <wp:effectExtent l="0" t="0" r="0" b="0"/>
             <wp:docPr id="2" name="Picture 2"/>
@@ -25951,7 +25987,7 @@
           <w:noProof/>
         </w:rPr>
         <w:drawing>
-          <wp:inline distT="0" distB="0" distL="0" distR="0" wp14:anchorId="38274184" wp14:editId="55092444">
+          <wp:inline distT="0" distB="0" distL="0" distR="0" wp14:anchorId="6227F93D" wp14:editId="32917F24">
             <wp:extent cx="4754880" cy="2852928"/>
             <wp:effectExtent l="0" t="0" r="0" b="0"/>
             <wp:docPr id="3" name="Picture 3"/>
@@ -30464,7 +30500,7 @@
         </w:rPr>
         <w:lastRenderedPageBreak/>
         <w:drawing>
-          <wp:inline distT="0" distB="0" distL="0" distR="0" wp14:anchorId="5AC13133" wp14:editId="40894BF7">
+          <wp:inline distT="0" distB="0" distL="0" distR="0" wp14:anchorId="12C743B9" wp14:editId="017DDA2A">
             <wp:extent cx="5029200" cy="2828925"/>
             <wp:effectExtent l="0" t="0" r="0" b="0"/>
             <wp:docPr id="4" name="Picture 4"/>
@@ -32779,6 +32815,70 @@
       <w:pPr>
         <w:spacing w:before="60" w:after="60" w:line="288" w:lineRule="auto"/>
         <w:ind w:firstLine="567"/>
+      </w:pPr>
+      <w:r>
+        <w:rPr>
+          <w:b/>
+          <w:sz w:val="24"/>
+        </w:rPr>
+        <w:t>Liên k</w:t>
+      </w:r>
+      <w:r>
+        <w:rPr>
+          <w:b/>
+          <w:sz w:val="24"/>
+        </w:rPr>
+        <w:t>ế</w:t>
+      </w:r>
+      <w:r>
+        <w:rPr>
+          <w:b/>
+          <w:sz w:val="24"/>
+        </w:rPr>
+        <w:t>t truy c</w:t>
+      </w:r>
+      <w:r>
+        <w:rPr>
+          <w:b/>
+          <w:sz w:val="24"/>
+        </w:rPr>
+        <w:t>ậ</w:t>
+      </w:r>
+      <w:r>
+        <w:rPr>
+          <w:b/>
+          <w:sz w:val="24"/>
+        </w:rPr>
+        <w:t>p kho lưu tr</w:t>
+      </w:r>
+      <w:r>
+        <w:rPr>
+          <w:b/>
+          <w:sz w:val="24"/>
+        </w:rPr>
+        <w:t>ữ</w:t>
+      </w:r>
+      <w:r>
+        <w:rPr>
+          <w:b/>
+          <w:sz w:val="24"/>
+        </w:rPr>
+        <w:t xml:space="preserve"> GitHub: </w:t>
+      </w:r>
+      <w:r>
+        <w:rPr>
+          <w:b/>
+          <w:color w:val="0066CC"/>
+          <w:sz w:val="24"/>
+          <w:u w:val="single"/>
+        </w:rPr>
+        <w:t>https://github.com/QuanPhan78/-n-big-data</w:t>
+      </w:r>
+    </w:p>
+    <w:p>
+      <w:pPr>
+        <w:spacing w:before="60" w:after="60" w:line="288" w:lineRule="auto"/>
+        <w:ind w:firstLine="567"/>
         <w:jc w:val="both"/>
       </w:pPr>
       <w:r>
@@ -33009,7 +33109,31 @@
         <w:rPr>
           <w:sz w:val="25"/>
         </w:rPr>
-        <w:t>c 1 (Kh</w:t>
+        <w:t>c 1 (T</w:t>
+      </w:r>
+      <w:r>
+        <w:rPr>
+          <w:sz w:val="25"/>
+        </w:rPr>
+        <w:t>ả</w:t>
+      </w:r>
+      <w:r>
+        <w:rPr>
+          <w:sz w:val="25"/>
+        </w:rPr>
+        <w:t>i mã ngu</w:t>
+      </w:r>
+      <w:r>
+        <w:rPr>
+          <w:sz w:val="25"/>
+        </w:rPr>
+        <w:t>ồ</w:t>
+      </w:r>
+      <w:r>
+        <w:rPr>
+          <w:sz w:val="25"/>
+        </w:rPr>
+        <w:t>n &amp; Kh</w:t>
       </w:r>
       <w:r>
         <w:rPr>
@@ -33045,7 +33169,7 @@
         <w:rPr>
           <w:sz w:val="25"/>
         </w:rPr>
-        <w:t>m Docker): docker-compose up -d (kh</w:t>
+        <w:t>m Docker): git clone https://github.com/QuanPhan78/-n-big-data.git &amp;&amp; docker-compose up -d (kh</w:t>
       </w:r>
       <w:r>
         <w:rPr>
@@ -33083,6 +33207,7 @@
           <w:b/>
           <w:sz w:val="25"/>
         </w:rPr>
+        <w:lastRenderedPageBreak/>
         <w:t xml:space="preserve">• </w:t>
       </w:r>
       <w:r>
@@ -33337,7 +33462,6 @@
         <w:rPr>
           <w:b/>
         </w:rPr>
-        <w:lastRenderedPageBreak/>
         <w:t>6.3. Nh</w:t>
       </w:r>
       <w:r>
@@ -36179,6 +36303,7 @@
               <w:rPr>
                 <w:sz w:val="19"/>
               </w:rPr>
+              <w:lastRenderedPageBreak/>
               <w:t>Phan Minh Quân</w:t>
             </w:r>
           </w:p>
@@ -36544,7 +36669,6 @@
               <w:rPr>
                 <w:sz w:val="19"/>
               </w:rPr>
-              <w:lastRenderedPageBreak/>
               <w:t>H</w:t>
             </w:r>
             <w:r>
@@ -37572,31 +37696,31 @@
       </w:rPr>
     </w:lvl>
   </w:abstractNum>
-  <w:num w:numId="1" w16cid:durableId="2093089429">
+  <w:num w:numId="1" w16cid:durableId="1387297523">
     <w:abstractNumId w:val="8"/>
   </w:num>
-  <w:num w:numId="2" w16cid:durableId="1436906201">
+  <w:num w:numId="2" w16cid:durableId="1246106600">
     <w:abstractNumId w:val="6"/>
   </w:num>
-  <w:num w:numId="3" w16cid:durableId="1197884761">
+  <w:num w:numId="3" w16cid:durableId="485249762">
     <w:abstractNumId w:val="5"/>
   </w:num>
-  <w:num w:numId="4" w16cid:durableId="2100055463">
+  <w:num w:numId="4" w16cid:durableId="2058580750">
     <w:abstractNumId w:val="4"/>
   </w:num>
-  <w:num w:numId="5" w16cid:durableId="1904369556">
+  <w:num w:numId="5" w16cid:durableId="821701201">
     <w:abstractNumId w:val="7"/>
   </w:num>
-  <w:num w:numId="6" w16cid:durableId="1558973917">
+  <w:num w:numId="6" w16cid:durableId="1484393158">
     <w:abstractNumId w:val="3"/>
   </w:num>
-  <w:num w:numId="7" w16cid:durableId="1611819777">
+  <w:num w:numId="7" w16cid:durableId="1158227601">
     <w:abstractNumId w:val="2"/>
   </w:num>
-  <w:num w:numId="8" w16cid:durableId="451636596">
+  <w:num w:numId="8" w16cid:durableId="271785168">
     <w:abstractNumId w:val="1"/>
   </w:num>
-  <w:num w:numId="9" w16cid:durableId="1222667389">
+  <w:num w:numId="9" w16cid:durableId="1336955844">
     <w:abstractNumId w:val="0"/>
   </w:num>
 </w:numbering>

</xml_diff>